<commit_message>
Pagina Web ALMEXA actualizada: informe tecnico completo (RF1-RF8, 39 anexos, i18n EN/ES, licencia BSL)
</commit_message>
<xml_diff>
--- a/public/anexos/03-Diagramas/Documentacion_Diagrama_de_Dominio_CORREGIDO.docx
+++ b/public/anexos/03-Diagramas/Documentacion_Diagrama_de_Dominio_CORREGIDO.docx
@@ -41,7 +41,7 @@
         <w:jc w:val="center"/>
       </w:pPr>
       <w:r>
-        <w:t xml:space="preserve">Programa ADSO - Ficha 3407799 - CIES, SENA | Julio de 2026</w:t>
+        <w:t>Programa ADSO - Ficha 3407799 - CIES, SENA | Septiembre de 2026</w:t>
       </w:r>
     </w:p>
     <w:p>
@@ -731,7 +731,7 @@
           <w:sz w:val="20"/>
           <w:szCs w:val="20"/>
         </w:rPr>
-        <w:t xml:space="preserve">Es asignado a uno o varios Usuario.</w:t>
+        <w:t>Es asignado a uno o varios usuarios.</w:t>
       </w:r>
     </w:p>
     <w:p>
@@ -1582,7 +1582,7 @@
           <w:sz w:val="20"/>
           <w:szCs w:val="20"/>
         </w:rPr>
-        <w:t xml:space="preserve">Suministra uno o varios Producto · Origina una o varias Ruta.</w:t>
+        <w:t>Suministra uno o varios productos · Origina una o varias Ruta.</w:t>
       </w:r>
     </w:p>
     <w:p>
@@ -1815,6 +1815,59 @@
                 <w:sz w:val="18"/>
                 <w:szCs w:val="18"/>
               </w:rPr>
+              <w:t xml:space="preserve">nit</w:t>
+            </w:r>
+          </w:p>
+        </w:tc>
+        <w:tc>
+          <w:tcPr>
+            <w:tcW w:type="dxa" w:w="984"/>
+          </w:tcPr>
+          <w:p>
+            <w:r>
+              <w:rPr>
+                <w:b w:val="false"/>
+                <w:bCs w:val="false"/>
+                <w:sz w:val="18"/>
+                <w:szCs w:val="18"/>
+              </w:rPr>
+              <w:t xml:space="preserve">String</w:t>
+            </w:r>
+          </w:p>
+        </w:tc>
+        <w:tc>
+          <w:tcPr>
+            <w:tcW w:type="dxa" w:w="6891"/>
+          </w:tcPr>
+          <w:p>
+            <w:r>
+              <w:rPr>
+                <w:b w:val="false"/>
+                <w:bCs w:val="false"/>
+                <w:sz w:val="18"/>
+                <w:szCs w:val="18"/>
+              </w:rPr>
+              <w:t xml:space="preserve">Número de Identificación Tributaria (NIT) del proveedor; único.</w:t>
+            </w:r>
+          </w:p>
+        </w:tc>
+      </w:tr>
+      <w:tr>
+        <w:trPr>
+          <w:cantSplit/>
+        </w:trPr>
+        <w:tc>
+          <w:tcPr>
+            <w:tcW w:type="dxa" w:w="1125"/>
+          </w:tcPr>
+          <w:p>
+            <w:r>
+              <w:rPr>
+                <w:b w:val="false"/>
+                <w:bCs w:val="false"/>
+                <w:sz w:val="18"/>
+                <w:szCs w:val="18"/>
+              </w:rPr>
               <w:t xml:space="preserve">nombre</w:t>
             </w:r>
           </w:p>
@@ -2087,7 +2140,7 @@
           <w:sz w:val="20"/>
           <w:szCs w:val="20"/>
         </w:rPr>
-        <w:t xml:space="preserve">Es suministrado por un Proveedor · Tiene uno o varios MovimientoInventario · Se transporta en una o varias Ruta · Se ubica en un EspacioAlmacenamiento.</w:t>
+        <w:t>Es suministrado por un Proveedor · Tiene uno o varios movimientos de inventario · Se transporta en una o varias rutas · Se ubica en un EspacioAlmacenamiento.</w:t>
       </w:r>
     </w:p>
     <w:p>
@@ -3396,7 +3449,7 @@
           <w:sz w:val="20"/>
           <w:szCs w:val="20"/>
         </w:rPr>
-        <w:t xml:space="preserve">Es originada por un Proveedor · Transporta uno o varios Producto.</w:t>
+        <w:t>Es originada por un Proveedor · Transporta uno o varios productos.</w:t>
       </w:r>
     </w:p>
     <w:p>
@@ -3901,7 +3954,7 @@
           <w:sz w:val="20"/>
           <w:szCs w:val="20"/>
         </w:rPr>
-        <w:t xml:space="preserve">Almacena uno o varios Producto · Contiene uno o varios EquipoBodega.</w:t>
+        <w:t>Almacena uno o varios productos · Contiene uno o varios equipos de bodega.</w:t>
       </w:r>
     </w:p>
     <w:p>
@@ -5291,7 +5344,7 @@
           <w:sz w:val="20"/>
           <w:szCs w:val="20"/>
         </w:rPr>
-        <w:t xml:space="preserve">Posee uno o varios TokenAPI.</w:t>
+        <w:t>Posee uno o varios token de API.</w:t>
       </w:r>
     </w:p>
     <w:p>
@@ -5752,14 +5805,7 @@
           <w:sz w:val="20"/>
           <w:szCs w:val="20"/>
         </w:rPr>
-        <w:t xml:space="preserve">Requisitos Relacionados: </w:t>
-      </w:r>
-      <w:r>
-        <w:rPr>
-          <w:sz w:val="20"/>
-          <w:szCs w:val="20"/>
-        </w:rPr>
-        <w:t xml:space="preserve">ERF8.3, ERF8.4</w:t>
+        <w:t xml:space="preserve">Requisitos Relacionados: ERF8.3</w:t>
       </w:r>
     </w:p>
     <w:p>

</xml_diff>

<commit_message>
Web con 4 vistas (SRS, Analisis, Tecnico) + Informe de Analisis y ajustes finales de contenido
</commit_message>
<xml_diff>
--- a/public/anexos/03-Diagramas/Documentacion_Diagrama_de_Dominio_CORREGIDO.docx
+++ b/public/anexos/03-Diagramas/Documentacion_Diagrama_de_Dominio_CORREGIDO.docx
@@ -296,7 +296,7 @@
                 <w:sz w:val="18"/>
                 <w:szCs w:val="18"/>
               </w:rPr>
-              <w:t xml:space="preserve">Atributo</w:t>
+              <w:t>Atributo</w:t>
             </w:r>
           </w:p>
         </w:tc>
@@ -314,7 +314,7 @@
                 <w:sz w:val="18"/>
                 <w:szCs w:val="18"/>
               </w:rPr>
-              <w:t xml:space="preserve">Tipo</w:t>
+              <w:t>Tipo</w:t>
             </w:r>
           </w:p>
         </w:tc>
@@ -332,7 +332,7 @@
                 <w:sz w:val="18"/>
                 <w:szCs w:val="18"/>
               </w:rPr>
-              <w:t xml:space="preserve">Descripción</w:t>
+              <w:t>Descripción</w:t>
             </w:r>
           </w:p>
         </w:tc>
@@ -353,7 +353,7 @@
                 <w:sz w:val="18"/>
                 <w:szCs w:val="18"/>
               </w:rPr>
-              <w:t xml:space="preserve">id</w:t>
+              <w:t>id (PK)</w:t>
             </w:r>
           </w:p>
         </w:tc>
@@ -369,7 +369,7 @@
                 <w:sz w:val="18"/>
                 <w:szCs w:val="18"/>
               </w:rPr>
-              <w:t xml:space="preserve">int</w:t>
+              <w:t>int</w:t>
             </w:r>
           </w:p>
         </w:tc>
@@ -385,7 +385,7 @@
                 <w:sz w:val="18"/>
                 <w:szCs w:val="18"/>
               </w:rPr>
-              <w:t xml:space="preserve">Identificador único del usuario.</w:t>
+              <w:t>Identificador único del usuario.</w:t>
             </w:r>
           </w:p>
         </w:tc>
@@ -406,7 +406,7 @@
                 <w:sz w:val="18"/>
                 <w:szCs w:val="18"/>
               </w:rPr>
-              <w:t xml:space="preserve">nombre</w:t>
+              <w:t>nombre</w:t>
             </w:r>
           </w:p>
         </w:tc>
@@ -422,7 +422,7 @@
                 <w:sz w:val="18"/>
                 <w:szCs w:val="18"/>
               </w:rPr>
-              <w:t xml:space="preserve">String</w:t>
+              <w:t>String</w:t>
             </w:r>
           </w:p>
         </w:tc>
@@ -438,7 +438,7 @@
                 <w:sz w:val="18"/>
                 <w:szCs w:val="18"/>
               </w:rPr>
-              <w:t xml:space="preserve">Nombre completo del usuario.</w:t>
+              <w:t>Nombre completo del usuario.</w:t>
             </w:r>
           </w:p>
         </w:tc>
@@ -459,7 +459,7 @@
                 <w:sz w:val="18"/>
                 <w:szCs w:val="18"/>
               </w:rPr>
-              <w:t xml:space="preserve">correo</w:t>
+              <w:t>correo (UNIQUE)</w:t>
             </w:r>
           </w:p>
         </w:tc>
@@ -475,7 +475,7 @@
                 <w:sz w:val="18"/>
                 <w:szCs w:val="18"/>
               </w:rPr>
-              <w:t xml:space="preserve">String</w:t>
+              <w:t>String</w:t>
             </w:r>
           </w:p>
         </w:tc>
@@ -491,7 +491,7 @@
                 <w:sz w:val="18"/>
                 <w:szCs w:val="18"/>
               </w:rPr>
-              <w:t xml:space="preserve">Correo usado para autenticación y notificaciones.</w:t>
+              <w:t>Correo usado para autenticación y notificaciones.</w:t>
             </w:r>
           </w:p>
         </w:tc>
@@ -512,7 +512,7 @@
                 <w:sz w:val="18"/>
                 <w:szCs w:val="18"/>
               </w:rPr>
-              <w:t xml:space="preserve">contraseña</w:t>
+              <w:t>contraseña</w:t>
             </w:r>
           </w:p>
         </w:tc>
@@ -528,7 +528,7 @@
                 <w:sz w:val="18"/>
                 <w:szCs w:val="18"/>
               </w:rPr>
-              <w:t xml:space="preserve">String</w:t>
+              <w:t>String</w:t>
             </w:r>
           </w:p>
         </w:tc>
@@ -544,7 +544,7 @@
                 <w:sz w:val="18"/>
                 <w:szCs w:val="18"/>
               </w:rPr>
-              <w:t xml:space="preserve">Credencial de acceso almacenada cifrada (seguridad RNF5).</w:t>
+              <w:t>Credencial de acceso almacenada cifrada (seguridad RNF5).</w:t>
             </w:r>
           </w:p>
         </w:tc>
@@ -565,7 +565,7 @@
                 <w:sz w:val="18"/>
                 <w:szCs w:val="18"/>
               </w:rPr>
-              <w:t xml:space="preserve">estado</w:t>
+              <w:t>rol_id (FK)</w:t>
             </w:r>
           </w:p>
         </w:tc>
@@ -581,7 +581,7 @@
                 <w:sz w:val="18"/>
                 <w:szCs w:val="18"/>
               </w:rPr>
-              <w:t xml:space="preserve">boolean</w:t>
+              <w:t>int</w:t>
             </w:r>
           </w:p>
         </w:tc>
@@ -597,7 +597,7 @@
                 <w:sz w:val="18"/>
                 <w:szCs w:val="18"/>
               </w:rPr>
-              <w:t xml:space="preserve">Indica si la cuenta está activa o desactivada.</w:t>
+              <w:t>Rol del usuario; referencia a Rol.id.</w:t>
             </w:r>
           </w:p>
         </w:tc>
@@ -618,7 +618,7 @@
                 <w:sz w:val="18"/>
                 <w:szCs w:val="18"/>
               </w:rPr>
-              <w:t xml:space="preserve">ultimoAcceso</w:t>
+              <w:t>estado</w:t>
             </w:r>
           </w:p>
         </w:tc>
@@ -634,7 +634,7 @@
                 <w:sz w:val="18"/>
                 <w:szCs w:val="18"/>
               </w:rPr>
-              <w:t xml:space="preserve">DateTime</w:t>
+              <w:t>boolean</w:t>
             </w:r>
           </w:p>
         </w:tc>
@@ -650,7 +650,60 @@
                 <w:sz w:val="18"/>
                 <w:szCs w:val="18"/>
               </w:rPr>
-              <w:t xml:space="preserve">Fecha y hora del último inicio de sesión.</w:t>
+              <w:t>Indica si la cuenta está activa o desactivada.</w:t>
+            </w:r>
+          </w:p>
+        </w:tc>
+      </w:tr>
+      <w:tr>
+        <w:trPr>
+          <w:cantSplit/>
+        </w:trPr>
+        <w:tc>
+          <w:tcPr>
+            <w:tcW w:type="dxa" w:w="1403"/>
+          </w:tcPr>
+          <w:p>
+            <w:r>
+              <w:rPr>
+                <w:b w:val="false"/>
+                <w:bCs w:val="false"/>
+                <w:sz w:val="18"/>
+                <w:szCs w:val="18"/>
+              </w:rPr>
+              <w:t>ultimoAcceso</w:t>
+            </w:r>
+          </w:p>
+        </w:tc>
+        <w:tc>
+          <w:tcPr>
+            <w:tcW w:type="dxa" w:w="935"/>
+          </w:tcPr>
+          <w:p>
+            <w:r>
+              <w:rPr>
+                <w:b w:val="false"/>
+                <w:bCs w:val="false"/>
+                <w:sz w:val="18"/>
+                <w:szCs w:val="18"/>
+              </w:rPr>
+              <w:t>DateTime</w:t>
+            </w:r>
+          </w:p>
+        </w:tc>
+        <w:tc>
+          <w:tcPr>
+            <w:tcW w:type="dxa" w:w="6662"/>
+          </w:tcPr>
+          <w:p>
+            <w:r>
+              <w:rPr>
+                <w:b w:val="false"/>
+                <w:bCs w:val="false"/>
+                <w:sz w:val="18"/>
+                <w:szCs w:val="18"/>
+              </w:rPr>
+              <w:t>Fecha y hora del último inicio de sesión.</w:t>
             </w:r>
           </w:p>
         </w:tc>
@@ -854,7 +907,7 @@
                 <w:sz w:val="18"/>
                 <w:szCs w:val="18"/>
               </w:rPr>
-              <w:t xml:space="preserve">Atributo</w:t>
+              <w:t>Atributo</w:t>
             </w:r>
           </w:p>
         </w:tc>
@@ -872,7 +925,7 @@
                 <w:sz w:val="18"/>
                 <w:szCs w:val="18"/>
               </w:rPr>
-              <w:t xml:space="preserve">Tipo</w:t>
+              <w:t>Tipo</w:t>
             </w:r>
           </w:p>
         </w:tc>
@@ -890,7 +943,7 @@
                 <w:sz w:val="18"/>
                 <w:szCs w:val="18"/>
               </w:rPr>
-              <w:t xml:space="preserve">Descripción</w:t>
+              <w:t>Descripción</w:t>
             </w:r>
           </w:p>
         </w:tc>
@@ -911,7 +964,7 @@
                 <w:sz w:val="18"/>
                 <w:szCs w:val="18"/>
               </w:rPr>
-              <w:t xml:space="preserve">id</w:t>
+              <w:t>id (PK)</w:t>
             </w:r>
           </w:p>
         </w:tc>
@@ -927,7 +980,7 @@
                 <w:sz w:val="18"/>
                 <w:szCs w:val="18"/>
               </w:rPr>
-              <w:t xml:space="preserve">int</w:t>
+              <w:t>int</w:t>
             </w:r>
           </w:p>
         </w:tc>
@@ -943,7 +996,7 @@
                 <w:sz w:val="18"/>
                 <w:szCs w:val="18"/>
               </w:rPr>
-              <w:t xml:space="preserve">Identificador único del rol.</w:t>
+              <w:t>Identificador único del rol.</w:t>
             </w:r>
           </w:p>
         </w:tc>
@@ -964,7 +1017,7 @@
                 <w:sz w:val="18"/>
                 <w:szCs w:val="18"/>
               </w:rPr>
-              <w:t xml:space="preserve">nombre</w:t>
+              <w:t>nombre</w:t>
             </w:r>
           </w:p>
         </w:tc>
@@ -980,7 +1033,7 @@
                 <w:sz w:val="18"/>
                 <w:szCs w:val="18"/>
               </w:rPr>
-              <w:t xml:space="preserve">String</w:t>
+              <w:t>String</w:t>
             </w:r>
           </w:p>
         </w:tc>
@@ -996,7 +1049,7 @@
                 <w:sz w:val="18"/>
                 <w:szCs w:val="18"/>
               </w:rPr>
-              <w:t xml:space="preserve">Nombre del rol (Administrador, Bodeguero, Técnico, Consultor).</w:t>
+              <w:t>Nombre del rol (Administrador, Bodeguero, Técnico, Consultor).</w:t>
             </w:r>
           </w:p>
         </w:tc>
@@ -1017,7 +1070,7 @@
                 <w:sz w:val="18"/>
                 <w:szCs w:val="18"/>
               </w:rPr>
-              <w:t xml:space="preserve">descripcion</w:t>
+              <w:t>descripcion</w:t>
             </w:r>
           </w:p>
         </w:tc>
@@ -1033,7 +1086,7 @@
                 <w:sz w:val="18"/>
                 <w:szCs w:val="18"/>
               </w:rPr>
-              <w:t xml:space="preserve">String</w:t>
+              <w:t>String</w:t>
             </w:r>
           </w:p>
         </w:tc>
@@ -1049,7 +1102,7 @@
                 <w:sz w:val="18"/>
                 <w:szCs w:val="18"/>
               </w:rPr>
-              <w:t xml:space="preserve">Detalle de las funciones y alcance del rol.</w:t>
+              <w:t>Detalle de las funciones y alcance del rol.</w:t>
             </w:r>
           </w:p>
         </w:tc>
@@ -1253,7 +1306,7 @@
                 <w:sz w:val="18"/>
                 <w:szCs w:val="18"/>
               </w:rPr>
-              <w:t xml:space="preserve">Atributo</w:t>
+              <w:t>Atributo</w:t>
             </w:r>
           </w:p>
         </w:tc>
@@ -1271,7 +1324,7 @@
                 <w:sz w:val="18"/>
                 <w:szCs w:val="18"/>
               </w:rPr>
-              <w:t xml:space="preserve">Tipo</w:t>
+              <w:t>Tipo</w:t>
             </w:r>
           </w:p>
         </w:tc>
@@ -1289,7 +1342,7 @@
                 <w:sz w:val="18"/>
                 <w:szCs w:val="18"/>
               </w:rPr>
-              <w:t xml:space="preserve">Descripción</w:t>
+              <w:t>Descripción</w:t>
             </w:r>
           </w:p>
         </w:tc>
@@ -1310,7 +1363,7 @@
                 <w:sz w:val="18"/>
                 <w:szCs w:val="18"/>
               </w:rPr>
-              <w:t xml:space="preserve">id</w:t>
+              <w:t>id (PK)</w:t>
             </w:r>
           </w:p>
         </w:tc>
@@ -1326,7 +1379,7 @@
                 <w:sz w:val="18"/>
                 <w:szCs w:val="18"/>
               </w:rPr>
-              <w:t xml:space="preserve">int</w:t>
+              <w:t>int</w:t>
             </w:r>
           </w:p>
         </w:tc>
@@ -1342,7 +1395,7 @@
                 <w:sz w:val="18"/>
                 <w:szCs w:val="18"/>
               </w:rPr>
-              <w:t xml:space="preserve">Identificador único del registro.</w:t>
+              <w:t>Identificador único del registro.</w:t>
             </w:r>
           </w:p>
         </w:tc>
@@ -1363,7 +1416,7 @@
                 <w:sz w:val="18"/>
                 <w:szCs w:val="18"/>
               </w:rPr>
-              <w:t xml:space="preserve">fecha</w:t>
+              <w:t>fecha</w:t>
             </w:r>
           </w:p>
         </w:tc>
@@ -1379,7 +1432,7 @@
                 <w:sz w:val="18"/>
                 <w:szCs w:val="18"/>
               </w:rPr>
-              <w:t xml:space="preserve">DateTime</w:t>
+              <w:t>DateTime</w:t>
             </w:r>
           </w:p>
         </w:tc>
@@ -1395,7 +1448,7 @@
                 <w:sz w:val="18"/>
                 <w:szCs w:val="18"/>
               </w:rPr>
-              <w:t xml:space="preserve">Momento exacto del evento.</w:t>
+              <w:t>Momento exacto del evento.</w:t>
             </w:r>
           </w:p>
         </w:tc>
@@ -1416,7 +1469,7 @@
                 <w:sz w:val="18"/>
                 <w:szCs w:val="18"/>
               </w:rPr>
-              <w:t xml:space="preserve">accion</w:t>
+              <w:t>accion</w:t>
             </w:r>
           </w:p>
         </w:tc>
@@ -1432,7 +1485,7 @@
                 <w:sz w:val="18"/>
                 <w:szCs w:val="18"/>
               </w:rPr>
-              <w:t xml:space="preserve">String</w:t>
+              <w:t>String</w:t>
             </w:r>
           </w:p>
         </w:tc>
@@ -1448,7 +1501,7 @@
                 <w:sz w:val="18"/>
                 <w:szCs w:val="18"/>
               </w:rPr>
-              <w:t xml:space="preserve">Acción realizada (inicio de sesión, acceso a módulo, etc.).</w:t>
+              <w:t>Acción realizada (inicio de sesión, acceso a módulo, etc.).</w:t>
             </w:r>
           </w:p>
         </w:tc>
@@ -1469,7 +1522,7 @@
                 <w:sz w:val="18"/>
                 <w:szCs w:val="18"/>
               </w:rPr>
-              <w:t xml:space="preserve">resultado</w:t>
+              <w:t>resultado</w:t>
             </w:r>
           </w:p>
         </w:tc>
@@ -1485,7 +1538,7 @@
                 <w:sz w:val="18"/>
                 <w:szCs w:val="18"/>
               </w:rPr>
-              <w:t xml:space="preserve">String</w:t>
+              <w:t>String</w:t>
             </w:r>
           </w:p>
         </w:tc>
@@ -1501,7 +1554,60 @@
                 <w:sz w:val="18"/>
                 <w:szCs w:val="18"/>
               </w:rPr>
-              <w:t xml:space="preserve">Resultado del intento: concedido o denegado.</w:t>
+              <w:t>Resultado del intento: concedido o denegado.</w:t>
+            </w:r>
+          </w:p>
+        </w:tc>
+      </w:tr>
+      <w:tr>
+        <w:trPr>
+          <w:cantSplit/>
+        </w:trPr>
+        <w:tc>
+          <w:tcPr>
+            <w:tcW w:type="dxa" w:w="1066"/>
+          </w:tcPr>
+          <w:p>
+            <w:r>
+              <w:rPr>
+                <w:b w:val="false"/>
+                <w:bCs w:val="false"/>
+                <w:sz w:val="18"/>
+                <w:szCs w:val="18"/>
+              </w:rPr>
+              <w:t>usuario_id (FK)</w:t>
+            </w:r>
+          </w:p>
+        </w:tc>
+        <w:tc>
+          <w:tcPr>
+            <w:tcW w:type="dxa" w:w="947"/>
+          </w:tcPr>
+          <w:p>
+            <w:r>
+              <w:rPr>
+                <w:b w:val="false"/>
+                <w:bCs w:val="false"/>
+                <w:sz w:val="18"/>
+                <w:szCs w:val="18"/>
+              </w:rPr>
+              <w:t>int</w:t>
+            </w:r>
+          </w:p>
+        </w:tc>
+        <w:tc>
+          <w:tcPr>
+            <w:tcW w:type="dxa" w:w="6987"/>
+          </w:tcPr>
+          <w:p>
+            <w:r>
+              <w:rPr>
+                <w:b w:val="false"/>
+                <w:bCs w:val="false"/>
+                <w:sz w:val="18"/>
+                <w:szCs w:val="18"/>
+              </w:rPr>
+              <w:t>Usuario que genera el registro; referencia a Usuario.id.</w:t>
             </w:r>
           </w:p>
         </w:tc>
@@ -1705,7 +1811,7 @@
                 <w:sz w:val="18"/>
                 <w:szCs w:val="18"/>
               </w:rPr>
-              <w:t xml:space="preserve">Atributo</w:t>
+              <w:t>Atributo</w:t>
             </w:r>
           </w:p>
         </w:tc>
@@ -1723,7 +1829,7 @@
                 <w:sz w:val="18"/>
                 <w:szCs w:val="18"/>
               </w:rPr>
-              <w:t xml:space="preserve">Tipo</w:t>
+              <w:t>Tipo</w:t>
             </w:r>
           </w:p>
         </w:tc>
@@ -1741,7 +1847,7 @@
                 <w:sz w:val="18"/>
                 <w:szCs w:val="18"/>
               </w:rPr>
-              <w:t xml:space="preserve">Descripción</w:t>
+              <w:t>Descripción</w:t>
             </w:r>
           </w:p>
         </w:tc>
@@ -1762,7 +1868,7 @@
                 <w:sz w:val="18"/>
                 <w:szCs w:val="18"/>
               </w:rPr>
-              <w:t xml:space="preserve">id</w:t>
+              <w:t>id (PK)</w:t>
             </w:r>
           </w:p>
         </w:tc>
@@ -1778,7 +1884,7 @@
                 <w:sz w:val="18"/>
                 <w:szCs w:val="18"/>
               </w:rPr>
-              <w:t xml:space="preserve">int</w:t>
+              <w:t>int</w:t>
             </w:r>
           </w:p>
         </w:tc>
@@ -1794,7 +1900,7 @@
                 <w:sz w:val="18"/>
                 <w:szCs w:val="18"/>
               </w:rPr>
-              <w:t xml:space="preserve">Identificador único del proveedor.</w:t>
+              <w:t>Identificador único del proveedor.</w:t>
             </w:r>
           </w:p>
         </w:tc>
@@ -1815,7 +1921,7 @@
                 <w:sz w:val="18"/>
                 <w:szCs w:val="18"/>
               </w:rPr>
-              <w:t xml:space="preserve">nit</w:t>
+              <w:t>nit (UNIQUE)</w:t>
             </w:r>
           </w:p>
         </w:tc>
@@ -1831,7 +1937,7 @@
                 <w:sz w:val="18"/>
                 <w:szCs w:val="18"/>
               </w:rPr>
-              <w:t xml:space="preserve">String</w:t>
+              <w:t>String</w:t>
             </w:r>
           </w:p>
         </w:tc>
@@ -1847,7 +1953,7 @@
                 <w:sz w:val="18"/>
                 <w:szCs w:val="18"/>
               </w:rPr>
-              <w:t xml:space="preserve">Número de Identificación Tributaria (NIT) del proveedor; único.</w:t>
+              <w:t>Número de Identificación Tributaria (NIT); único.</w:t>
             </w:r>
           </w:p>
         </w:tc>
@@ -1868,7 +1974,7 @@
                 <w:sz w:val="18"/>
                 <w:szCs w:val="18"/>
               </w:rPr>
-              <w:t xml:space="preserve">nombre</w:t>
+              <w:t>nombre</w:t>
             </w:r>
           </w:p>
         </w:tc>
@@ -1884,7 +1990,7 @@
                 <w:sz w:val="18"/>
                 <w:szCs w:val="18"/>
               </w:rPr>
-              <w:t xml:space="preserve">String</w:t>
+              <w:t>String</w:t>
             </w:r>
           </w:p>
         </w:tc>
@@ -1900,7 +2006,7 @@
                 <w:sz w:val="18"/>
                 <w:szCs w:val="18"/>
               </w:rPr>
-              <w:t xml:space="preserve">Razón social o nombre comercial.</w:t>
+              <w:t>Razón social o nombre comercial.</w:t>
             </w:r>
           </w:p>
         </w:tc>
@@ -1921,7 +2027,7 @@
                 <w:sz w:val="18"/>
                 <w:szCs w:val="18"/>
               </w:rPr>
-              <w:t xml:space="preserve">contacto</w:t>
+              <w:t>contacto</w:t>
             </w:r>
           </w:p>
         </w:tc>
@@ -1937,7 +2043,7 @@
                 <w:sz w:val="18"/>
                 <w:szCs w:val="18"/>
               </w:rPr>
-              <w:t xml:space="preserve">String</w:t>
+              <w:t>String</w:t>
             </w:r>
           </w:p>
         </w:tc>
@@ -1953,7 +2059,7 @@
                 <w:sz w:val="18"/>
                 <w:szCs w:val="18"/>
               </w:rPr>
-              <w:t xml:space="preserve">Persona de contacto.</w:t>
+              <w:t>Persona de contacto.</w:t>
             </w:r>
           </w:p>
         </w:tc>
@@ -1974,7 +2080,7 @@
                 <w:sz w:val="18"/>
                 <w:szCs w:val="18"/>
               </w:rPr>
-              <w:t xml:space="preserve">telefono</w:t>
+              <w:t>telefono</w:t>
             </w:r>
           </w:p>
         </w:tc>
@@ -1990,7 +2096,7 @@
                 <w:sz w:val="18"/>
                 <w:szCs w:val="18"/>
               </w:rPr>
-              <w:t xml:space="preserve">String</w:t>
+              <w:t>String</w:t>
             </w:r>
           </w:p>
         </w:tc>
@@ -2006,7 +2112,7 @@
                 <w:sz w:val="18"/>
                 <w:szCs w:val="18"/>
               </w:rPr>
-              <w:t xml:space="preserve">Número de contacto.</w:t>
+              <w:t>Número de contacto.</w:t>
             </w:r>
           </w:p>
         </w:tc>
@@ -2027,7 +2133,7 @@
                 <w:sz w:val="18"/>
                 <w:szCs w:val="18"/>
               </w:rPr>
-              <w:t xml:space="preserve">estado</w:t>
+              <w:t>estado</w:t>
             </w:r>
           </w:p>
         </w:tc>
@@ -2043,7 +2149,7 @@
                 <w:sz w:val="18"/>
                 <w:szCs w:val="18"/>
               </w:rPr>
-              <w:t xml:space="preserve">boolean</w:t>
+              <w:t>boolean</w:t>
             </w:r>
           </w:p>
         </w:tc>
@@ -2059,7 +2165,7 @@
                 <w:sz w:val="18"/>
                 <w:szCs w:val="18"/>
               </w:rPr>
-              <w:t xml:space="preserve">Indica si el proveedor está activo o desactivado.</w:t>
+              <w:t>Indica si el proveedor está activo o desactivado.</w:t>
             </w:r>
           </w:p>
         </w:tc>
@@ -2280,7 +2386,7 @@
                 <w:sz w:val="18"/>
                 <w:szCs w:val="18"/>
               </w:rPr>
-              <w:t xml:space="preserve">Atributo</w:t>
+              <w:t>Atributo</w:t>
             </w:r>
           </w:p>
         </w:tc>
@@ -2298,7 +2404,7 @@
                 <w:sz w:val="18"/>
                 <w:szCs w:val="18"/>
               </w:rPr>
-              <w:t xml:space="preserve">Tipo</w:t>
+              <w:t>Tipo</w:t>
             </w:r>
           </w:p>
         </w:tc>
@@ -2316,7 +2422,7 @@
                 <w:sz w:val="18"/>
                 <w:szCs w:val="18"/>
               </w:rPr>
-              <w:t xml:space="preserve">Descripción</w:t>
+              <w:t>Descripción</w:t>
             </w:r>
           </w:p>
         </w:tc>
@@ -2337,7 +2443,7 @@
                 <w:sz w:val="18"/>
                 <w:szCs w:val="18"/>
               </w:rPr>
-              <w:t xml:space="preserve">id</w:t>
+              <w:t>id (PK)</w:t>
             </w:r>
           </w:p>
         </w:tc>
@@ -2353,7 +2459,7 @@
                 <w:sz w:val="18"/>
                 <w:szCs w:val="18"/>
               </w:rPr>
-              <w:t xml:space="preserve">int</w:t>
+              <w:t>int</w:t>
             </w:r>
           </w:p>
         </w:tc>
@@ -2369,7 +2475,7 @@
                 <w:sz w:val="18"/>
                 <w:szCs w:val="18"/>
               </w:rPr>
-              <w:t xml:space="preserve">Identificador único del producto.</w:t>
+              <w:t>Identificador único del producto.</w:t>
             </w:r>
           </w:p>
         </w:tc>
@@ -2390,7 +2496,7 @@
                 <w:sz w:val="18"/>
                 <w:szCs w:val="18"/>
               </w:rPr>
-              <w:t xml:space="preserve">codigo</w:t>
+              <w:t>codigo (UNIQUE)</w:t>
             </w:r>
           </w:p>
         </w:tc>
@@ -2406,7 +2512,7 @@
                 <w:sz w:val="18"/>
                 <w:szCs w:val="18"/>
               </w:rPr>
-              <w:t xml:space="preserve">String</w:t>
+              <w:t>String</w:t>
             </w:r>
           </w:p>
         </w:tc>
@@ -2422,7 +2528,7 @@
                 <w:sz w:val="18"/>
                 <w:szCs w:val="18"/>
               </w:rPr>
-              <w:t xml:space="preserve">Código o número de serie único.</w:t>
+              <w:t>Código o número de serie único.</w:t>
             </w:r>
           </w:p>
         </w:tc>
@@ -2443,7 +2549,7 @@
                 <w:sz w:val="18"/>
                 <w:szCs w:val="18"/>
               </w:rPr>
-              <w:t xml:space="preserve">nombre</w:t>
+              <w:t>nombre</w:t>
             </w:r>
           </w:p>
         </w:tc>
@@ -2459,7 +2565,7 @@
                 <w:sz w:val="18"/>
                 <w:szCs w:val="18"/>
               </w:rPr>
-              <w:t xml:space="preserve">String</w:t>
+              <w:t>String</w:t>
             </w:r>
           </w:p>
         </w:tc>
@@ -2475,7 +2581,7 @@
                 <w:sz w:val="18"/>
                 <w:szCs w:val="18"/>
               </w:rPr>
-              <w:t xml:space="preserve">Nombre descriptivo del producto.</w:t>
+              <w:t>Nombre descriptivo del producto.</w:t>
             </w:r>
           </w:p>
         </w:tc>
@@ -2496,7 +2602,7 @@
                 <w:sz w:val="18"/>
                 <w:szCs w:val="18"/>
               </w:rPr>
-              <w:t xml:space="preserve">descripcion</w:t>
+              <w:t>descripcion</w:t>
             </w:r>
           </w:p>
         </w:tc>
@@ -2512,7 +2618,7 @@
                 <w:sz w:val="18"/>
                 <w:szCs w:val="18"/>
               </w:rPr>
-              <w:t xml:space="preserve">String</w:t>
+              <w:t>String</w:t>
             </w:r>
           </w:p>
         </w:tc>
@@ -2522,13 +2628,7 @@
           </w:tcPr>
           <w:p>
             <w:r>
-              <w:rPr>
-                <w:b w:val="false"/>
-                <w:bCs w:val="false"/>
-                <w:sz w:val="18"/>
-                <w:szCs w:val="18"/>
-              </w:rPr>
-              <w:t xml:space="preserve">Descripción detallada del producto.</w:t>
+              <w:t>Descripción del producto (ERF5.1).</w:t>
             </w:r>
           </w:p>
         </w:tc>
@@ -2549,7 +2649,7 @@
                 <w:sz w:val="18"/>
                 <w:szCs w:val="18"/>
               </w:rPr>
-              <w:t xml:space="preserve">categoria</w:t>
+              <w:t>categoria</w:t>
             </w:r>
           </w:p>
         </w:tc>
@@ -2565,7 +2665,7 @@
                 <w:sz w:val="18"/>
                 <w:szCs w:val="18"/>
               </w:rPr>
-              <w:t xml:space="preserve">String</w:t>
+              <w:t>String</w:t>
             </w:r>
           </w:p>
         </w:tc>
@@ -2581,7 +2681,7 @@
                 <w:sz w:val="18"/>
                 <w:szCs w:val="18"/>
               </w:rPr>
-              <w:t xml:space="preserve">Categoría a la que pertenece.</w:t>
+              <w:t>Categoría a la que pertenece.</w:t>
             </w:r>
           </w:p>
         </w:tc>
@@ -2602,7 +2702,7 @@
                 <w:sz w:val="18"/>
                 <w:szCs w:val="18"/>
               </w:rPr>
-              <w:t xml:space="preserve">precio</w:t>
+              <w:t>precio</w:t>
             </w:r>
           </w:p>
         </w:tc>
@@ -2618,7 +2718,7 @@
                 <w:sz w:val="18"/>
                 <w:szCs w:val="18"/>
               </w:rPr>
-              <w:t xml:space="preserve">decimal</w:t>
+              <w:t>decimal</w:t>
             </w:r>
           </w:p>
         </w:tc>
@@ -2628,13 +2728,7 @@
           </w:tcPr>
           <w:p>
             <w:r>
-              <w:rPr>
-                <w:b w:val="false"/>
-                <w:bCs w:val="false"/>
-                <w:sz w:val="18"/>
-                <w:szCs w:val="18"/>
-              </w:rPr>
-              <w:t xml:space="preserve">Precio del producto (requerido para reportes de stock y valores).</w:t>
+              <w:t>Precio del producto (ERF5.1, requerido para reportes de stock y valores).</w:t>
             </w:r>
           </w:p>
         </w:tc>
@@ -2655,7 +2749,7 @@
                 <w:sz w:val="18"/>
                 <w:szCs w:val="18"/>
               </w:rPr>
-              <w:t xml:space="preserve">stockActual</w:t>
+              <w:t>stockActual</w:t>
             </w:r>
           </w:p>
         </w:tc>
@@ -2671,7 +2765,7 @@
                 <w:sz w:val="18"/>
                 <w:szCs w:val="18"/>
               </w:rPr>
-              <w:t xml:space="preserve">int</w:t>
+              <w:t>int</w:t>
             </w:r>
           </w:p>
         </w:tc>
@@ -2687,7 +2781,7 @@
                 <w:sz w:val="18"/>
                 <w:szCs w:val="18"/>
               </w:rPr>
-              <w:t xml:space="preserve">Cantidad disponible en inventario.</w:t>
+              <w:t>Cantidad disponible en inventario.</w:t>
             </w:r>
           </w:p>
         </w:tc>
@@ -2708,7 +2802,7 @@
                 <w:sz w:val="18"/>
                 <w:szCs w:val="18"/>
               </w:rPr>
-              <w:t xml:space="preserve">stockMinimo</w:t>
+              <w:t>stockMinimo</w:t>
             </w:r>
           </w:p>
         </w:tc>
@@ -2724,7 +2818,7 @@
                 <w:sz w:val="18"/>
                 <w:szCs w:val="18"/>
               </w:rPr>
-              <w:t xml:space="preserve">int</w:t>
+              <w:t>int</w:t>
             </w:r>
           </w:p>
         </w:tc>
@@ -2740,7 +2834,7 @@
                 <w:sz w:val="18"/>
                 <w:szCs w:val="18"/>
               </w:rPr>
-              <w:t xml:space="preserve">Umbral de alerta de reabastecimiento.</w:t>
+              <w:t>Umbral de alerta de reabastecimiento.</w:t>
             </w:r>
           </w:p>
         </w:tc>
@@ -2761,7 +2855,7 @@
                 <w:sz w:val="18"/>
                 <w:szCs w:val="18"/>
               </w:rPr>
-              <w:t xml:space="preserve">fechaCaducidad</w:t>
+              <w:t>fechaCaducidad</w:t>
             </w:r>
           </w:p>
         </w:tc>
@@ -2777,7 +2871,7 @@
                 <w:sz w:val="18"/>
                 <w:szCs w:val="18"/>
               </w:rPr>
-              <w:t xml:space="preserve">Date</w:t>
+              <w:t>Date</w:t>
             </w:r>
           </w:p>
         </w:tc>
@@ -2793,7 +2887,113 @@
                 <w:sz w:val="18"/>
                 <w:szCs w:val="18"/>
               </w:rPr>
-              <w:t xml:space="preserve">Fecha de vencimiento, cuando aplica.</w:t>
+              <w:t>Fecha de vencimiento, cuando aplica.</w:t>
+            </w:r>
+          </w:p>
+        </w:tc>
+      </w:tr>
+      <w:tr>
+        <w:trPr>
+          <w:cantSplit/>
+        </w:trPr>
+        <w:tc>
+          <w:tcPr>
+            <w:tcW w:type="dxa" w:w="1465"/>
+          </w:tcPr>
+          <w:p>
+            <w:r>
+              <w:rPr>
+                <w:b w:val="false"/>
+                <w:bCs w:val="false"/>
+                <w:sz w:val="18"/>
+                <w:szCs w:val="18"/>
+              </w:rPr>
+              <w:t>proveedor_id (FK)</w:t>
+            </w:r>
+          </w:p>
+        </w:tc>
+        <w:tc>
+          <w:tcPr>
+            <w:tcW w:type="dxa" w:w="733"/>
+          </w:tcPr>
+          <w:p>
+            <w:r>
+              <w:rPr>
+                <w:b w:val="false"/>
+                <w:bCs w:val="false"/>
+                <w:sz w:val="18"/>
+                <w:szCs w:val="18"/>
+              </w:rPr>
+              <w:t>int</w:t>
+            </w:r>
+          </w:p>
+        </w:tc>
+        <w:tc>
+          <w:tcPr>
+            <w:tcW w:type="dxa" w:w="6802"/>
+          </w:tcPr>
+          <w:p>
+            <w:r>
+              <w:rPr>
+                <w:b w:val="false"/>
+                <w:bCs w:val="false"/>
+                <w:sz w:val="18"/>
+                <w:szCs w:val="18"/>
+              </w:rPr>
+              <w:t>Proveedor que suministra el producto; referencia a Proveedor.id.</w:t>
+            </w:r>
+          </w:p>
+        </w:tc>
+      </w:tr>
+      <w:tr>
+        <w:trPr>
+          <w:cantSplit/>
+        </w:trPr>
+        <w:tc>
+          <w:tcPr>
+            <w:tcW w:type="dxa" w:w="1465"/>
+          </w:tcPr>
+          <w:p>
+            <w:r>
+              <w:rPr>
+                <w:b w:val="false"/>
+                <w:bCs w:val="false"/>
+                <w:sz w:val="18"/>
+                <w:szCs w:val="18"/>
+              </w:rPr>
+              <w:t>espacio_id (FK)</w:t>
+            </w:r>
+          </w:p>
+        </w:tc>
+        <w:tc>
+          <w:tcPr>
+            <w:tcW w:type="dxa" w:w="733"/>
+          </w:tcPr>
+          <w:p>
+            <w:r>
+              <w:rPr>
+                <w:b w:val="false"/>
+                <w:bCs w:val="false"/>
+                <w:sz w:val="18"/>
+                <w:szCs w:val="18"/>
+              </w:rPr>
+              <w:t>int</w:t>
+            </w:r>
+          </w:p>
+        </w:tc>
+        <w:tc>
+          <w:tcPr>
+            <w:tcW w:type="dxa" w:w="6802"/>
+          </w:tcPr>
+          <w:p>
+            <w:r>
+              <w:rPr>
+                <w:b w:val="false"/>
+                <w:bCs w:val="false"/>
+                <w:sz w:val="18"/>
+                <w:szCs w:val="18"/>
+              </w:rPr>
+              <w:t>Espacio donde se ubica el producto; referencia a EspacioAlmacenamiento.id.</w:t>
             </w:r>
           </w:p>
         </w:tc>
@@ -3014,7 +3214,7 @@
                 <w:sz w:val="18"/>
                 <w:szCs w:val="18"/>
               </w:rPr>
-              <w:t xml:space="preserve">Atributo</w:t>
+              <w:t>Atributo</w:t>
             </w:r>
           </w:p>
         </w:tc>
@@ -3032,7 +3232,7 @@
                 <w:sz w:val="18"/>
                 <w:szCs w:val="18"/>
               </w:rPr>
-              <w:t xml:space="preserve">Tipo</w:t>
+              <w:t>Tipo</w:t>
             </w:r>
           </w:p>
         </w:tc>
@@ -3050,7 +3250,7 @@
                 <w:sz w:val="18"/>
                 <w:szCs w:val="18"/>
               </w:rPr>
-              <w:t xml:space="preserve">Descripción</w:t>
+              <w:t>Descripción</w:t>
             </w:r>
           </w:p>
         </w:tc>
@@ -3071,7 +3271,7 @@
                 <w:sz w:val="18"/>
                 <w:szCs w:val="18"/>
               </w:rPr>
-              <w:t xml:space="preserve">id</w:t>
+              <w:t>id (PK)</w:t>
             </w:r>
           </w:p>
         </w:tc>
@@ -3087,7 +3287,7 @@
                 <w:sz w:val="18"/>
                 <w:szCs w:val="18"/>
               </w:rPr>
-              <w:t xml:space="preserve">int</w:t>
+              <w:t>int</w:t>
             </w:r>
           </w:p>
         </w:tc>
@@ -3103,7 +3303,7 @@
                 <w:sz w:val="18"/>
                 <w:szCs w:val="18"/>
               </w:rPr>
-              <w:t xml:space="preserve">Identificador único del movimiento.</w:t>
+              <w:t>Identificador único del movimiento.</w:t>
             </w:r>
           </w:p>
         </w:tc>
@@ -3124,7 +3324,7 @@
                 <w:sz w:val="18"/>
                 <w:szCs w:val="18"/>
               </w:rPr>
-              <w:t xml:space="preserve">tipo</w:t>
+              <w:t>tipo</w:t>
             </w:r>
           </w:p>
         </w:tc>
@@ -3140,7 +3340,7 @@
                 <w:sz w:val="18"/>
                 <w:szCs w:val="18"/>
               </w:rPr>
-              <w:t xml:space="preserve">String</w:t>
+              <w:t>String</w:t>
             </w:r>
           </w:p>
         </w:tc>
@@ -3156,7 +3356,7 @@
                 <w:sz w:val="18"/>
                 <w:szCs w:val="18"/>
               </w:rPr>
-              <w:t xml:space="preserve">Tipo: entrada, salida o ajuste.</w:t>
+              <w:t>Tipo: entrada, salida o ajuste.</w:t>
             </w:r>
           </w:p>
         </w:tc>
@@ -3177,7 +3377,7 @@
                 <w:sz w:val="18"/>
                 <w:szCs w:val="18"/>
               </w:rPr>
-              <w:t xml:space="preserve">cantidad</w:t>
+              <w:t>cantidad</w:t>
             </w:r>
           </w:p>
         </w:tc>
@@ -3193,7 +3393,7 @@
                 <w:sz w:val="18"/>
                 <w:szCs w:val="18"/>
               </w:rPr>
-              <w:t xml:space="preserve">int</w:t>
+              <w:t>int</w:t>
             </w:r>
           </w:p>
         </w:tc>
@@ -3209,7 +3409,7 @@
                 <w:sz w:val="18"/>
                 <w:szCs w:val="18"/>
               </w:rPr>
-              <w:t xml:space="preserve">Cantidad de unidades del movimiento.</w:t>
+              <w:t>Cantidad de unidades del movimiento.</w:t>
             </w:r>
           </w:p>
         </w:tc>
@@ -3230,7 +3430,7 @@
                 <w:sz w:val="18"/>
                 <w:szCs w:val="18"/>
               </w:rPr>
-              <w:t xml:space="preserve">fechaHora</w:t>
+              <w:t>fechaHora</w:t>
             </w:r>
           </w:p>
         </w:tc>
@@ -3246,7 +3446,7 @@
                 <w:sz w:val="18"/>
                 <w:szCs w:val="18"/>
               </w:rPr>
-              <w:t xml:space="preserve">DateTime</w:t>
+              <w:t>DateTime</w:t>
             </w:r>
           </w:p>
         </w:tc>
@@ -3262,7 +3462,7 @@
                 <w:sz w:val="18"/>
                 <w:szCs w:val="18"/>
               </w:rPr>
-              <w:t xml:space="preserve">Fecha y hora exacta del movimiento.</w:t>
+              <w:t>Fecha y hora exacta del movimiento.</w:t>
             </w:r>
           </w:p>
         </w:tc>
@@ -3283,7 +3483,7 @@
                 <w:sz w:val="18"/>
                 <w:szCs w:val="18"/>
               </w:rPr>
-              <w:t xml:space="preserve">justificacion</w:t>
+              <w:t>justificacion</w:t>
             </w:r>
           </w:p>
         </w:tc>
@@ -3299,7 +3499,7 @@
                 <w:sz w:val="18"/>
                 <w:szCs w:val="18"/>
               </w:rPr>
-              <w:t xml:space="preserve">String</w:t>
+              <w:t>String</w:t>
             </w:r>
           </w:p>
         </w:tc>
@@ -3315,7 +3515,7 @@
                 <w:sz w:val="18"/>
                 <w:szCs w:val="18"/>
               </w:rPr>
-              <w:t xml:space="preserve">Motivo del movimiento, obligatorio en el ajuste manual (ERF5.9).</w:t>
+              <w:t>Motivo del movimiento, obligatorio en el ajuste manual (ERF5.9).</w:t>
             </w:r>
           </w:p>
         </w:tc>
@@ -3336,7 +3536,7 @@
                 <w:sz w:val="18"/>
                 <w:szCs w:val="18"/>
               </w:rPr>
-              <w:t xml:space="preserve">usuarioId</w:t>
+              <w:t>producto_id (FK)</w:t>
             </w:r>
           </w:p>
         </w:tc>
@@ -3352,7 +3552,7 @@
                 <w:sz w:val="18"/>
                 <w:szCs w:val="18"/>
               </w:rPr>
-              <w:t xml:space="preserve">int</w:t>
+              <w:t>int</w:t>
             </w:r>
           </w:p>
         </w:tc>
@@ -3368,7 +3568,60 @@
                 <w:sz w:val="18"/>
                 <w:szCs w:val="18"/>
               </w:rPr>
-              <w:t xml:space="preserve">Usuario responsable del movimiento.</w:t>
+              <w:t>Producto afectado; referencia a Producto.id.</w:t>
+            </w:r>
+          </w:p>
+        </w:tc>
+      </w:tr>
+      <w:tr>
+        <w:trPr>
+          <w:cantSplit/>
+        </w:trPr>
+        <w:tc>
+          <w:tcPr>
+            <w:tcW w:type="dxa" w:w="1376"/>
+          </w:tcPr>
+          <w:p>
+            <w:r>
+              <w:rPr>
+                <w:b w:val="false"/>
+                <w:bCs w:val="false"/>
+                <w:sz w:val="18"/>
+                <w:szCs w:val="18"/>
+              </w:rPr>
+              <w:t>usuario_id (FK)</w:t>
+            </w:r>
+          </w:p>
+        </w:tc>
+        <w:tc>
+          <w:tcPr>
+            <w:tcW w:type="dxa" w:w="847"/>
+          </w:tcPr>
+          <w:p>
+            <w:r>
+              <w:rPr>
+                <w:b w:val="false"/>
+                <w:bCs w:val="false"/>
+                <w:sz w:val="18"/>
+                <w:szCs w:val="18"/>
+              </w:rPr>
+              <w:t>int</w:t>
+            </w:r>
+          </w:p>
+        </w:tc>
+        <w:tc>
+          <w:tcPr>
+            <w:tcW w:type="dxa" w:w="6777"/>
+          </w:tcPr>
+          <w:p>
+            <w:r>
+              <w:rPr>
+                <w:b w:val="false"/>
+                <w:bCs w:val="false"/>
+                <w:sz w:val="18"/>
+                <w:szCs w:val="18"/>
+              </w:rPr>
+              <w:t>Usuario responsable; referencia a Usuario.id.</w:t>
             </w:r>
           </w:p>
         </w:tc>
@@ -3572,7 +3825,7 @@
                 <w:sz w:val="18"/>
                 <w:szCs w:val="18"/>
               </w:rPr>
-              <w:t xml:space="preserve">Atributo</w:t>
+              <w:t>Atributo</w:t>
             </w:r>
           </w:p>
         </w:tc>
@@ -3590,7 +3843,7 @@
                 <w:sz w:val="18"/>
                 <w:szCs w:val="18"/>
               </w:rPr>
-              <w:t xml:space="preserve">Tipo</w:t>
+              <w:t>Tipo</w:t>
             </w:r>
           </w:p>
         </w:tc>
@@ -3608,7 +3861,7 @@
                 <w:sz w:val="18"/>
                 <w:szCs w:val="18"/>
               </w:rPr>
-              <w:t xml:space="preserve">Descripción</w:t>
+              <w:t>Descripción</w:t>
             </w:r>
           </w:p>
         </w:tc>
@@ -3629,7 +3882,7 @@
                 <w:sz w:val="18"/>
                 <w:szCs w:val="18"/>
               </w:rPr>
-              <w:t xml:space="preserve">id</w:t>
+              <w:t>id (PK)</w:t>
             </w:r>
           </w:p>
         </w:tc>
@@ -3645,7 +3898,7 @@
                 <w:sz w:val="18"/>
                 <w:szCs w:val="18"/>
               </w:rPr>
-              <w:t xml:space="preserve">int</w:t>
+              <w:t>int</w:t>
             </w:r>
           </w:p>
         </w:tc>
@@ -3661,7 +3914,7 @@
                 <w:sz w:val="18"/>
                 <w:szCs w:val="18"/>
               </w:rPr>
-              <w:t xml:space="preserve">Identificador único de la ruta.</w:t>
+              <w:t>Identificador único de la ruta.</w:t>
             </w:r>
           </w:p>
         </w:tc>
@@ -3682,7 +3935,7 @@
                 <w:sz w:val="18"/>
                 <w:szCs w:val="18"/>
               </w:rPr>
-              <w:t xml:space="preserve">origen</w:t>
+              <w:t>origen</w:t>
             </w:r>
           </w:p>
         </w:tc>
@@ -3698,7 +3951,7 @@
                 <w:sz w:val="18"/>
                 <w:szCs w:val="18"/>
               </w:rPr>
-              <w:t xml:space="preserve">String</w:t>
+              <w:t>String</w:t>
             </w:r>
           </w:p>
         </w:tc>
@@ -3714,7 +3967,7 @@
                 <w:sz w:val="18"/>
                 <w:szCs w:val="18"/>
               </w:rPr>
-              <w:t xml:space="preserve">Punto de partida.</w:t>
+              <w:t>Punto de partida.</w:t>
             </w:r>
           </w:p>
         </w:tc>
@@ -3735,7 +3988,7 @@
                 <w:sz w:val="18"/>
                 <w:szCs w:val="18"/>
               </w:rPr>
-              <w:t xml:space="preserve">destino</w:t>
+              <w:t>destino</w:t>
             </w:r>
           </w:p>
         </w:tc>
@@ -3751,7 +4004,7 @@
                 <w:sz w:val="18"/>
                 <w:szCs w:val="18"/>
               </w:rPr>
-              <w:t xml:space="preserve">String</w:t>
+              <w:t>String</w:t>
             </w:r>
           </w:p>
         </w:tc>
@@ -3767,7 +4020,7 @@
                 <w:sz w:val="18"/>
                 <w:szCs w:val="18"/>
               </w:rPr>
-              <w:t xml:space="preserve">Punto de llegada.</w:t>
+              <w:t>Punto de llegada.</w:t>
             </w:r>
           </w:p>
         </w:tc>
@@ -3788,7 +4041,7 @@
                 <w:sz w:val="18"/>
                 <w:szCs w:val="18"/>
               </w:rPr>
-              <w:t xml:space="preserve">fechaEstimada</w:t>
+              <w:t>fechaEstimada</w:t>
             </w:r>
           </w:p>
         </w:tc>
@@ -3804,7 +4057,7 @@
                 <w:sz w:val="18"/>
                 <w:szCs w:val="18"/>
               </w:rPr>
-              <w:t xml:space="preserve">Date</w:t>
+              <w:t>Date</w:t>
             </w:r>
           </w:p>
         </w:tc>
@@ -3820,7 +4073,7 @@
                 <w:sz w:val="18"/>
                 <w:szCs w:val="18"/>
               </w:rPr>
-              <w:t xml:space="preserve">Fecha estimada de llegada.</w:t>
+              <w:t>Fecha estimada de llegada.</w:t>
             </w:r>
           </w:p>
         </w:tc>
@@ -3841,7 +4094,7 @@
                 <w:sz w:val="18"/>
                 <w:szCs w:val="18"/>
               </w:rPr>
-              <w:t xml:space="preserve">estado</w:t>
+              <w:t>estado</w:t>
             </w:r>
           </w:p>
         </w:tc>
@@ -3857,7 +4110,7 @@
                 <w:sz w:val="18"/>
                 <w:szCs w:val="18"/>
               </w:rPr>
-              <w:t xml:space="preserve">String</w:t>
+              <w:t>String</w:t>
             </w:r>
           </w:p>
         </w:tc>
@@ -3873,7 +4126,288 @@
                 <w:sz w:val="18"/>
                 <w:szCs w:val="18"/>
               </w:rPr>
-              <w:t xml:space="preserve">Estado: en tránsito, retrasada, entregada o cancelada.</w:t>
+              <w:t>Estado: en tránsito, retrasada, entregada o cancelada.</w:t>
+            </w:r>
+          </w:p>
+        </w:tc>
+      </w:tr>
+      <w:tr>
+        <w:trPr>
+          <w:cantSplit/>
+        </w:trPr>
+        <w:tc>
+          <w:tcPr>
+            <w:tcW w:type="dxa" w:w="1603"/>
+          </w:tcPr>
+          <w:p>
+            <w:r>
+              <w:rPr>
+                <w:b w:val="false"/>
+                <w:bCs w:val="false"/>
+                <w:sz w:val="18"/>
+                <w:szCs w:val="18"/>
+              </w:rPr>
+              <w:t>proveedor_id (FK)</w:t>
+            </w:r>
+          </w:p>
+        </w:tc>
+        <w:tc>
+          <w:tcPr>
+            <w:tcW w:type="dxa" w:w="740"/>
+          </w:tcPr>
+          <w:p>
+            <w:r>
+              <w:rPr>
+                <w:b w:val="false"/>
+                <w:bCs w:val="false"/>
+                <w:sz w:val="18"/>
+                <w:szCs w:val="18"/>
+              </w:rPr>
+              <w:t>int</w:t>
+            </w:r>
+          </w:p>
+        </w:tc>
+        <w:tc>
+          <w:tcPr>
+            <w:tcW w:type="dxa" w:w="6657"/>
+          </w:tcPr>
+          <w:p>
+            <w:r>
+              <w:rPr>
+                <w:b w:val="false"/>
+                <w:bCs w:val="false"/>
+                <w:sz w:val="18"/>
+                <w:szCs w:val="18"/>
+              </w:rPr>
+              <w:t>Proveedor que origina la ruta; referencia a Proveedor.id.</w:t>
+            </w:r>
+          </w:p>
+        </w:tc>
+      </w:tr>
+    </w:tbl>
+    <w:p>
+      <w:pPr>
+        <w:spacing w:after="60" w:before="120"/>
+      </w:pPr>
+      <w:r>
+        <w:rPr>
+          <w:b/>
+          <w:bCs/>
+          <w:color w:val="06283D"/>
+          <w:sz w:val="19"/>
+          <w:szCs w:val="19"/>
+        </w:rPr>
+        <w:t>RutaProducto</w:t>
+      </w:r>
+    </w:p>
+    <w:p>
+      <w:pPr>
+        <w:spacing w:after="60"/>
+      </w:pPr>
+      <w:r>
+        <w:rPr>
+          <w:b/>
+          <w:bCs/>
+          <w:sz w:val="20"/>
+          <w:szCs w:val="20"/>
+        </w:rPr>
+        <w:t>Tipo: Entidad (tabla puente)</w:t>
+      </w:r>
+    </w:p>
+    <w:p>
+      <w:pPr>
+        <w:spacing w:after="60"/>
+      </w:pPr>
+      <w:r>
+        <w:rPr>
+          <w:b/>
+          <w:bCs/>
+          <w:sz w:val="20"/>
+          <w:szCs w:val="20"/>
+        </w:rPr>
+        <w:t>Descripción: Entidad puente que asocia una Ruta con los Productos transportados en ella, resolviendo la relación muchos a muchos Producto–Ruta del DER (físico).</w:t>
+      </w:r>
+    </w:p>
+    <w:tbl>
+      <w:tblPr>
+        <w:tblW w:type="dxa" w:w="9000"/>
+        <w:tblBorders>
+          <w:top w:val="single" w:color="auto" w:sz="4"/>
+          <w:left w:val="single" w:color="auto" w:sz="4"/>
+          <w:bottom w:val="single" w:color="auto" w:sz="4"/>
+          <w:right w:val="single" w:color="auto" w:sz="4"/>
+          <w:insideH w:val="single" w:color="auto" w:sz="4"/>
+          <w:insideV w:val="single" w:color="auto" w:sz="4"/>
+        </w:tblBorders>
+        <w:tblLayout w:type="fixed"/>
+      </w:tblPr>
+      <w:tblGrid>
+        <w:gridCol w:w="1603"/>
+        <w:gridCol w:w="740"/>
+        <w:gridCol w:w="6657"/>
+      </w:tblGrid>
+      <w:tr>
+        <w:trPr>
+          <w:cantSplit/>
+          <w:tblHeader/>
+        </w:trPr>
+        <w:tc>
+          <w:tcPr>
+            <w:shd w:fill="06283D" w:val="clear"/>
+            <w:tcW w:type="dxa" w:w="1603"/>
+          </w:tcPr>
+          <w:p>
+            <w:r>
+              <w:rPr>
+                <w:b/>
+                <w:bCs/>
+                <w:color w:val="FFFFFF"/>
+                <w:sz w:val="18"/>
+                <w:szCs w:val="18"/>
+              </w:rPr>
+              <w:t>Atributo</w:t>
+            </w:r>
+          </w:p>
+        </w:tc>
+        <w:tc>
+          <w:tcPr>
+            <w:shd w:fill="06283D" w:val="clear"/>
+            <w:tcW w:type="dxa" w:w="740"/>
+          </w:tcPr>
+          <w:p>
+            <w:r>
+              <w:rPr>
+                <w:b/>
+                <w:bCs/>
+                <w:color w:val="FFFFFF"/>
+                <w:sz w:val="18"/>
+                <w:szCs w:val="18"/>
+              </w:rPr>
+              <w:t>Tipo</w:t>
+            </w:r>
+          </w:p>
+        </w:tc>
+        <w:tc>
+          <w:tcPr>
+            <w:shd w:fill="06283D" w:val="clear"/>
+            <w:tcW w:type="dxa" w:w="6657"/>
+          </w:tcPr>
+          <w:p>
+            <w:r>
+              <w:rPr>
+                <w:b/>
+                <w:bCs/>
+                <w:color w:val="FFFFFF"/>
+                <w:sz w:val="18"/>
+                <w:szCs w:val="18"/>
+              </w:rPr>
+              <w:t>Descripción</w:t>
+            </w:r>
+          </w:p>
+        </w:tc>
+      </w:tr>
+      <w:tr>
+        <w:trPr>
+          <w:cantSplit/>
+        </w:trPr>
+        <w:tc>
+          <w:tcPr>
+            <w:tcW w:type="dxa" w:w="1603"/>
+          </w:tcPr>
+          <w:p>
+            <w:r>
+              <w:rPr>
+                <w:b w:val="false"/>
+                <w:bCs w:val="false"/>
+                <w:sz w:val="18"/>
+                <w:szCs w:val="18"/>
+              </w:rPr>
+              <w:t>ruta_id (PK, FK)</w:t>
+            </w:r>
+          </w:p>
+        </w:tc>
+        <w:tc>
+          <w:tcPr>
+            <w:tcW w:type="dxa" w:w="740"/>
+          </w:tcPr>
+          <w:p>
+            <w:r>
+              <w:rPr>
+                <w:b w:val="false"/>
+                <w:bCs w:val="false"/>
+                <w:sz w:val="18"/>
+                <w:szCs w:val="18"/>
+              </w:rPr>
+              <w:t>int</w:t>
+            </w:r>
+          </w:p>
+        </w:tc>
+        <w:tc>
+          <w:tcPr>
+            <w:tcW w:type="dxa" w:w="6657"/>
+          </w:tcPr>
+          <w:p>
+            <w:r>
+              <w:rPr>
+                <w:b w:val="false"/>
+                <w:bCs w:val="false"/>
+                <w:sz w:val="18"/>
+                <w:szCs w:val="18"/>
+              </w:rPr>
+              <w:t>Ruta asociada; referencia a Ruta.id.</w:t>
+            </w:r>
+          </w:p>
+        </w:tc>
+      </w:tr>
+      <w:tr>
+        <w:trPr>
+          <w:cantSplit/>
+        </w:trPr>
+        <w:tc>
+          <w:tcPr>
+            <w:tcW w:type="dxa" w:w="1603"/>
+          </w:tcPr>
+          <w:p>
+            <w:r>
+              <w:rPr>
+                <w:b w:val="false"/>
+                <w:bCs w:val="false"/>
+                <w:sz w:val="18"/>
+                <w:szCs w:val="18"/>
+              </w:rPr>
+              <w:t>producto_id (PK, FK)</w:t>
+            </w:r>
+          </w:p>
+        </w:tc>
+        <w:tc>
+          <w:tcPr>
+            <w:tcW w:type="dxa" w:w="740"/>
+          </w:tcPr>
+          <w:p>
+            <w:r>
+              <w:rPr>
+                <w:b w:val="false"/>
+                <w:bCs w:val="false"/>
+                <w:sz w:val="18"/>
+                <w:szCs w:val="18"/>
+              </w:rPr>
+              <w:t>int</w:t>
+            </w:r>
+          </w:p>
+        </w:tc>
+        <w:tc>
+          <w:tcPr>
+            <w:tcW w:type="dxa" w:w="6657"/>
+          </w:tcPr>
+          <w:p>
+            <w:r>
+              <w:rPr>
+                <w:b w:val="false"/>
+                <w:bCs w:val="false"/>
+                <w:sz w:val="18"/>
+                <w:szCs w:val="18"/>
+              </w:rPr>
+              <w:t>Producto transportado en la ruta; referencia a Producto.id.</w:t>
             </w:r>
           </w:p>
         </w:tc>
@@ -4094,7 +4628,7 @@
                 <w:sz w:val="18"/>
                 <w:szCs w:val="18"/>
               </w:rPr>
-              <w:t xml:space="preserve">Atributo</w:t>
+              <w:t>Atributo</w:t>
             </w:r>
           </w:p>
         </w:tc>
@@ -4112,7 +4646,7 @@
                 <w:sz w:val="18"/>
                 <w:szCs w:val="18"/>
               </w:rPr>
-              <w:t xml:space="preserve">Tipo</w:t>
+              <w:t>Tipo</w:t>
             </w:r>
           </w:p>
         </w:tc>
@@ -4130,7 +4664,7 @@
                 <w:sz w:val="18"/>
                 <w:szCs w:val="18"/>
               </w:rPr>
-              <w:t xml:space="preserve">Descripción</w:t>
+              <w:t>Descripción</w:t>
             </w:r>
           </w:p>
         </w:tc>
@@ -4151,7 +4685,7 @@
                 <w:sz w:val="18"/>
                 <w:szCs w:val="18"/>
               </w:rPr>
-              <w:t xml:space="preserve">id</w:t>
+              <w:t>id (PK)</w:t>
             </w:r>
           </w:p>
         </w:tc>
@@ -4167,7 +4701,7 @@
                 <w:sz w:val="18"/>
                 <w:szCs w:val="18"/>
               </w:rPr>
-              <w:t xml:space="preserve">int</w:t>
+              <w:t>int</w:t>
             </w:r>
           </w:p>
         </w:tc>
@@ -4183,7 +4717,7 @@
                 <w:sz w:val="18"/>
                 <w:szCs w:val="18"/>
               </w:rPr>
-              <w:t xml:space="preserve">Identificador único del espacio.</w:t>
+              <w:t>Identificador único del espacio.</w:t>
             </w:r>
           </w:p>
         </w:tc>
@@ -4204,7 +4738,7 @@
                 <w:sz w:val="18"/>
                 <w:szCs w:val="18"/>
               </w:rPr>
-              <w:t xml:space="preserve">tipo</w:t>
+              <w:t>tipo</w:t>
             </w:r>
           </w:p>
         </w:tc>
@@ -4220,7 +4754,7 @@
                 <w:sz w:val="18"/>
                 <w:szCs w:val="18"/>
               </w:rPr>
-              <w:t xml:space="preserve">String</w:t>
+              <w:t>String</w:t>
             </w:r>
           </w:p>
         </w:tc>
@@ -4236,7 +4770,7 @@
                 <w:sz w:val="18"/>
                 <w:szCs w:val="18"/>
               </w:rPr>
-              <w:t xml:space="preserve">Tipo: estantería, rack, gabinete, zona de piso, muelle.</w:t>
+              <w:t>Tipo: estantería, rack, gabinete, zona de piso, muelle.</w:t>
             </w:r>
           </w:p>
         </w:tc>
@@ -4257,7 +4791,7 @@
                 <w:sz w:val="18"/>
                 <w:szCs w:val="18"/>
               </w:rPr>
-              <w:t xml:space="preserve">capacidad</w:t>
+              <w:t>capacidad</w:t>
             </w:r>
           </w:p>
         </w:tc>
@@ -4273,7 +4807,7 @@
                 <w:sz w:val="18"/>
                 <w:szCs w:val="18"/>
               </w:rPr>
-              <w:t xml:space="preserve">int</w:t>
+              <w:t>int</w:t>
             </w:r>
           </w:p>
         </w:tc>
@@ -4289,7 +4823,7 @@
                 <w:sz w:val="18"/>
                 <w:szCs w:val="18"/>
               </w:rPr>
-              <w:t xml:space="preserve">Capacidad máxima de almacenamiento.</w:t>
+              <w:t>Capacidad máxima de almacenamiento.</w:t>
             </w:r>
           </w:p>
         </w:tc>
@@ -4310,7 +4844,7 @@
                 <w:sz w:val="18"/>
                 <w:szCs w:val="18"/>
               </w:rPr>
-              <w:t xml:space="preserve">ocupacion</w:t>
+              <w:t>ocupacion</w:t>
             </w:r>
           </w:p>
         </w:tc>
@@ -4326,7 +4860,7 @@
                 <w:sz w:val="18"/>
                 <w:szCs w:val="18"/>
               </w:rPr>
-              <w:t xml:space="preserve">decimal</w:t>
+              <w:t>decimal</w:t>
             </w:r>
           </w:p>
         </w:tc>
@@ -4342,7 +4876,7 @@
                 <w:sz w:val="18"/>
                 <w:szCs w:val="18"/>
               </w:rPr>
-              <w:t xml:space="preserve">Porcentaje de ocupación actual.</w:t>
+              <w:t>Porcentaje de ocupación actual.</w:t>
             </w:r>
           </w:p>
         </w:tc>
@@ -4363,7 +4897,7 @@
                 <w:sz w:val="18"/>
                 <w:szCs w:val="18"/>
               </w:rPr>
-              <w:t xml:space="preserve">estado</w:t>
+              <w:t>estado</w:t>
             </w:r>
           </w:p>
         </w:tc>
@@ -4379,7 +4913,7 @@
                 <w:sz w:val="18"/>
                 <w:szCs w:val="18"/>
               </w:rPr>
-              <w:t xml:space="preserve">boolean</w:t>
+              <w:t>boolean</w:t>
             </w:r>
           </w:p>
         </w:tc>
@@ -4395,7 +4929,7 @@
                 <w:sz w:val="18"/>
                 <w:szCs w:val="18"/>
               </w:rPr>
-              <w:t xml:space="preserve">Indica si está activo o desactivado.</w:t>
+              <w:t>Indica si está activo o desactivado.</w:t>
             </w:r>
           </w:p>
         </w:tc>
@@ -4599,7 +5133,7 @@
                 <w:sz w:val="18"/>
                 <w:szCs w:val="18"/>
               </w:rPr>
-              <w:t xml:space="preserve">Atributo</w:t>
+              <w:t>Atributo</w:t>
             </w:r>
           </w:p>
         </w:tc>
@@ -4617,7 +5151,7 @@
                 <w:sz w:val="18"/>
                 <w:szCs w:val="18"/>
               </w:rPr>
-              <w:t xml:space="preserve">Tipo</w:t>
+              <w:t>Tipo</w:t>
             </w:r>
           </w:p>
         </w:tc>
@@ -4635,7 +5169,7 @@
                 <w:sz w:val="18"/>
                 <w:szCs w:val="18"/>
               </w:rPr>
-              <w:t xml:space="preserve">Descripción</w:t>
+              <w:t>Descripción</w:t>
             </w:r>
           </w:p>
         </w:tc>
@@ -4656,7 +5190,7 @@
                 <w:sz w:val="18"/>
                 <w:szCs w:val="18"/>
               </w:rPr>
-              <w:t xml:space="preserve">id</w:t>
+              <w:t>id (PK)</w:t>
             </w:r>
           </w:p>
         </w:tc>
@@ -4672,7 +5206,7 @@
                 <w:sz w:val="18"/>
                 <w:szCs w:val="18"/>
               </w:rPr>
-              <w:t xml:space="preserve">int</w:t>
+              <w:t>int</w:t>
             </w:r>
           </w:p>
         </w:tc>
@@ -4688,7 +5222,7 @@
                 <w:sz w:val="18"/>
                 <w:szCs w:val="18"/>
               </w:rPr>
-              <w:t xml:space="preserve">Identificador único del equipo.</w:t>
+              <w:t>Identificador único del equipo.</w:t>
             </w:r>
           </w:p>
         </w:tc>
@@ -4709,7 +5243,7 @@
                 <w:sz w:val="18"/>
                 <w:szCs w:val="18"/>
               </w:rPr>
-              <w:t xml:space="preserve">nombre</w:t>
+              <w:t>nombre</w:t>
             </w:r>
           </w:p>
         </w:tc>
@@ -4725,7 +5259,7 @@
                 <w:sz w:val="18"/>
                 <w:szCs w:val="18"/>
               </w:rPr>
-              <w:t xml:space="preserve">String</w:t>
+              <w:t>String</w:t>
             </w:r>
           </w:p>
         </w:tc>
@@ -4741,7 +5275,7 @@
                 <w:sz w:val="18"/>
                 <w:szCs w:val="18"/>
               </w:rPr>
-              <w:t xml:space="preserve">Nombre o descripción del equipo.</w:t>
+              <w:t>Nombre o descripción del equipo.</w:t>
             </w:r>
           </w:p>
         </w:tc>
@@ -4762,7 +5296,7 @@
                 <w:sz w:val="18"/>
                 <w:szCs w:val="18"/>
               </w:rPr>
-              <w:t xml:space="preserve">estado</w:t>
+              <w:t>estado</w:t>
             </w:r>
           </w:p>
         </w:tc>
@@ -4778,7 +5312,7 @@
                 <w:sz w:val="18"/>
                 <w:szCs w:val="18"/>
               </w:rPr>
-              <w:t xml:space="preserve">String</w:t>
+              <w:t>String</w:t>
             </w:r>
           </w:p>
         </w:tc>
@@ -4794,7 +5328,60 @@
                 <w:sz w:val="18"/>
                 <w:szCs w:val="18"/>
               </w:rPr>
-              <w:t xml:space="preserve">Estado: operativo, en mantenimiento o fuera de servicio.</w:t>
+              <w:t>Estado: operativo, en mantenimiento o fuera de servicio.</w:t>
+            </w:r>
+          </w:p>
+        </w:tc>
+      </w:tr>
+      <w:tr>
+        <w:trPr>
+          <w:cantSplit/>
+        </w:trPr>
+        <w:tc>
+          <w:tcPr>
+            <w:tcW w:type="dxa" w:w="1029"/>
+          </w:tcPr>
+          <w:p>
+            <w:r>
+              <w:rPr>
+                <w:b w:val="false"/>
+                <w:bCs w:val="false"/>
+                <w:sz w:val="18"/>
+                <w:szCs w:val="18"/>
+              </w:rPr>
+              <w:t>espacio_id (FK)</w:t>
+            </w:r>
+          </w:p>
+        </w:tc>
+        <w:tc>
+          <w:tcPr>
+            <w:tcW w:type="dxa" w:w="771"/>
+          </w:tcPr>
+          <w:p>
+            <w:r>
+              <w:rPr>
+                <w:b w:val="false"/>
+                <w:bCs w:val="false"/>
+                <w:sz w:val="18"/>
+                <w:szCs w:val="18"/>
+              </w:rPr>
+              <w:t>int</w:t>
+            </w:r>
+          </w:p>
+        </w:tc>
+        <w:tc>
+          <w:tcPr>
+            <w:tcW w:type="dxa" w:w="7200"/>
+          </w:tcPr>
+          <w:p>
+            <w:r>
+              <w:rPr>
+                <w:b w:val="false"/>
+                <w:bCs w:val="false"/>
+                <w:sz w:val="18"/>
+                <w:szCs w:val="18"/>
+              </w:rPr>
+              <w:t>Espacio que contiene el equipo; referencia a EspacioAlmacenamiento.id.</w:t>
             </w:r>
           </w:p>
         </w:tc>
@@ -5015,7 +5602,7 @@
                 <w:sz w:val="18"/>
                 <w:szCs w:val="18"/>
               </w:rPr>
-              <w:t xml:space="preserve">Atributo</w:t>
+              <w:t>Atributo</w:t>
             </w:r>
           </w:p>
         </w:tc>
@@ -5033,7 +5620,7 @@
                 <w:sz w:val="18"/>
                 <w:szCs w:val="18"/>
               </w:rPr>
-              <w:t xml:space="preserve">Tipo</w:t>
+              <w:t>Tipo</w:t>
             </w:r>
           </w:p>
         </w:tc>
@@ -5051,7 +5638,7 @@
                 <w:sz w:val="18"/>
                 <w:szCs w:val="18"/>
               </w:rPr>
-              <w:t xml:space="preserve">Descripción</w:t>
+              <w:t>Descripción</w:t>
             </w:r>
           </w:p>
         </w:tc>
@@ -5072,7 +5659,7 @@
                 <w:sz w:val="18"/>
                 <w:szCs w:val="18"/>
               </w:rPr>
-              <w:t xml:space="preserve">id</w:t>
+              <w:t>id (PK)</w:t>
             </w:r>
           </w:p>
         </w:tc>
@@ -5088,7 +5675,7 @@
                 <w:sz w:val="18"/>
                 <w:szCs w:val="18"/>
               </w:rPr>
-              <w:t xml:space="preserve">int</w:t>
+              <w:t>int</w:t>
             </w:r>
           </w:p>
         </w:tc>
@@ -5104,7 +5691,7 @@
                 <w:sz w:val="18"/>
                 <w:szCs w:val="18"/>
               </w:rPr>
-              <w:t xml:space="preserve">Identificador único del reporte.</w:t>
+              <w:t>Identificador único del reporte.</w:t>
             </w:r>
           </w:p>
         </w:tc>
@@ -5125,7 +5712,7 @@
                 <w:sz w:val="18"/>
                 <w:szCs w:val="18"/>
               </w:rPr>
-              <w:t xml:space="preserve">tipo</w:t>
+              <w:t>tipo</w:t>
             </w:r>
           </w:p>
         </w:tc>
@@ -5141,7 +5728,7 @@
                 <w:sz w:val="18"/>
                 <w:szCs w:val="18"/>
               </w:rPr>
-              <w:t xml:space="preserve">String</w:t>
+              <w:t>String</w:t>
             </w:r>
           </w:p>
         </w:tc>
@@ -5157,7 +5744,7 @@
                 <w:sz w:val="18"/>
                 <w:szCs w:val="18"/>
               </w:rPr>
-              <w:t xml:space="preserve">Tipo de reporte (movimientos, entradas, stock bajo, etc.).</w:t>
+              <w:t>Tipo de reporte (movimientos, entradas, stock bajo, etc.).</w:t>
             </w:r>
           </w:p>
         </w:tc>
@@ -5178,7 +5765,7 @@
                 <w:sz w:val="18"/>
                 <w:szCs w:val="18"/>
               </w:rPr>
-              <w:t xml:space="preserve">fechaGeneracion</w:t>
+              <w:t>fechaGeneracion</w:t>
             </w:r>
           </w:p>
         </w:tc>
@@ -5194,7 +5781,7 @@
                 <w:sz w:val="18"/>
                 <w:szCs w:val="18"/>
               </w:rPr>
-              <w:t xml:space="preserve">DateTime</w:t>
+              <w:t>DateTime</w:t>
             </w:r>
           </w:p>
         </w:tc>
@@ -5210,7 +5797,7 @@
                 <w:sz w:val="18"/>
                 <w:szCs w:val="18"/>
               </w:rPr>
-              <w:t xml:space="preserve">Fecha y hora de generación.</w:t>
+              <w:t>Fecha y hora de generación.</w:t>
             </w:r>
           </w:p>
         </w:tc>
@@ -5231,7 +5818,7 @@
                 <w:sz w:val="18"/>
                 <w:szCs w:val="18"/>
               </w:rPr>
-              <w:t xml:space="preserve">formato</w:t>
+              <w:t>formato</w:t>
             </w:r>
           </w:p>
         </w:tc>
@@ -5247,7 +5834,7 @@
                 <w:sz w:val="18"/>
                 <w:szCs w:val="18"/>
               </w:rPr>
-              <w:t xml:space="preserve">String</w:t>
+              <w:t>String</w:t>
             </w:r>
           </w:p>
         </w:tc>
@@ -5263,7 +5850,60 @@
                 <w:sz w:val="18"/>
                 <w:szCs w:val="18"/>
               </w:rPr>
-              <w:t xml:space="preserve">Formato de exportación: PDF o Excel.</w:t>
+              <w:t>Formato de exportación: PDF o Excel.</w:t>
+            </w:r>
+          </w:p>
+        </w:tc>
+      </w:tr>
+      <w:tr>
+        <w:trPr>
+          <w:cantSplit/>
+        </w:trPr>
+        <w:tc>
+          <w:tcPr>
+            <w:tcW w:type="dxa" w:w="1667"/>
+          </w:tcPr>
+          <w:p>
+            <w:r>
+              <w:rPr>
+                <w:b w:val="false"/>
+                <w:bCs w:val="false"/>
+                <w:sz w:val="18"/>
+                <w:szCs w:val="18"/>
+              </w:rPr>
+              <w:t>usuario_id (FK)</w:t>
+            </w:r>
+          </w:p>
+        </w:tc>
+        <w:tc>
+          <w:tcPr>
+            <w:tcW w:type="dxa" w:w="889"/>
+          </w:tcPr>
+          <w:p>
+            <w:r>
+              <w:rPr>
+                <w:b w:val="false"/>
+                <w:bCs w:val="false"/>
+                <w:sz w:val="18"/>
+                <w:szCs w:val="18"/>
+              </w:rPr>
+              <w:t>int</w:t>
+            </w:r>
+          </w:p>
+        </w:tc>
+        <w:tc>
+          <w:tcPr>
+            <w:tcW w:type="dxa" w:w="6444"/>
+          </w:tcPr>
+          <w:p>
+            <w:r>
+              <w:rPr>
+                <w:b w:val="false"/>
+                <w:bCs w:val="false"/>
+                <w:sz w:val="18"/>
+                <w:szCs w:val="18"/>
+              </w:rPr>
+              <w:t>Usuario que genera el reporte; referencia a Usuario.id.</w:t>
             </w:r>
           </w:p>
         </w:tc>
@@ -5467,7 +6107,7 @@
                 <w:sz w:val="18"/>
                 <w:szCs w:val="18"/>
               </w:rPr>
-              <w:t xml:space="preserve">Atributo</w:t>
+              <w:t>Atributo</w:t>
             </w:r>
           </w:p>
         </w:tc>
@@ -5485,7 +6125,7 @@
                 <w:sz w:val="18"/>
                 <w:szCs w:val="18"/>
               </w:rPr>
-              <w:t xml:space="preserve">Tipo</w:t>
+              <w:t>Tipo</w:t>
             </w:r>
           </w:p>
         </w:tc>
@@ -5503,7 +6143,7 @@
                 <w:sz w:val="18"/>
                 <w:szCs w:val="18"/>
               </w:rPr>
-              <w:t xml:space="preserve">Descripción</w:t>
+              <w:t>Descripción</w:t>
             </w:r>
           </w:p>
         </w:tc>
@@ -5524,7 +6164,7 @@
                 <w:sz w:val="18"/>
                 <w:szCs w:val="18"/>
               </w:rPr>
-              <w:t xml:space="preserve">id</w:t>
+              <w:t>id (PK)</w:t>
             </w:r>
           </w:p>
         </w:tc>
@@ -5540,7 +6180,7 @@
                 <w:sz w:val="18"/>
                 <w:szCs w:val="18"/>
               </w:rPr>
-              <w:t xml:space="preserve">int</w:t>
+              <w:t>int</w:t>
             </w:r>
           </w:p>
         </w:tc>
@@ -5556,7 +6196,7 @@
                 <w:sz w:val="18"/>
                 <w:szCs w:val="18"/>
               </w:rPr>
-              <w:t xml:space="preserve">Identificador único del sistema externo.</w:t>
+              <w:t>Identificador único del sistema externo.</w:t>
             </w:r>
           </w:p>
         </w:tc>
@@ -5577,7 +6217,7 @@
                 <w:sz w:val="18"/>
                 <w:szCs w:val="18"/>
               </w:rPr>
-              <w:t xml:space="preserve">nombre</w:t>
+              <w:t>nombre</w:t>
             </w:r>
           </w:p>
         </w:tc>
@@ -5593,7 +6233,7 @@
                 <w:sz w:val="18"/>
                 <w:szCs w:val="18"/>
               </w:rPr>
-              <w:t xml:space="preserve">String</w:t>
+              <w:t>String</w:t>
             </w:r>
           </w:p>
         </w:tc>
@@ -5609,7 +6249,7 @@
                 <w:sz w:val="18"/>
                 <w:szCs w:val="18"/>
               </w:rPr>
-              <w:t xml:space="preserve">Nombre del sistema o aplicación externa.</w:t>
+              <w:t>Nombre del sistema o aplicación externa.</w:t>
             </w:r>
           </w:p>
         </w:tc>
@@ -5630,7 +6270,7 @@
                 <w:sz w:val="18"/>
                 <w:szCs w:val="18"/>
               </w:rPr>
-              <w:t xml:space="preserve">estado</w:t>
+              <w:t>estado</w:t>
             </w:r>
           </w:p>
         </w:tc>
@@ -5646,7 +6286,7 @@
                 <w:sz w:val="18"/>
                 <w:szCs w:val="18"/>
               </w:rPr>
-              <w:t xml:space="preserve">boolean</w:t>
+              <w:t>boolean</w:t>
             </w:r>
           </w:p>
         </w:tc>
@@ -5662,7 +6302,7 @@
                 <w:sz w:val="18"/>
                 <w:szCs w:val="18"/>
               </w:rPr>
-              <w:t xml:space="preserve">Indica si está habilitado para consumir la API.</w:t>
+              <w:t>Indica si está habilitado para consumir la API.</w:t>
             </w:r>
           </w:p>
         </w:tc>
@@ -5859,7 +6499,7 @@
                 <w:sz w:val="18"/>
                 <w:szCs w:val="18"/>
               </w:rPr>
-              <w:t xml:space="preserve">Atributo</w:t>
+              <w:t>Atributo</w:t>
             </w:r>
           </w:p>
         </w:tc>
@@ -5877,7 +6517,7 @@
                 <w:sz w:val="18"/>
                 <w:szCs w:val="18"/>
               </w:rPr>
-              <w:t xml:space="preserve">Tipo</w:t>
+              <w:t>Tipo</w:t>
             </w:r>
           </w:p>
         </w:tc>
@@ -5895,7 +6535,7 @@
                 <w:sz w:val="18"/>
                 <w:szCs w:val="18"/>
               </w:rPr>
-              <w:t xml:space="preserve">Descripción</w:t>
+              <w:t>Descripción</w:t>
             </w:r>
           </w:p>
         </w:tc>
@@ -5916,7 +6556,7 @@
                 <w:sz w:val="18"/>
                 <w:szCs w:val="18"/>
               </w:rPr>
-              <w:t xml:space="preserve">id</w:t>
+              <w:t>id (PK)</w:t>
             </w:r>
           </w:p>
         </w:tc>
@@ -5932,7 +6572,7 @@
                 <w:sz w:val="18"/>
                 <w:szCs w:val="18"/>
               </w:rPr>
-              <w:t xml:space="preserve">int</w:t>
+              <w:t>int</w:t>
             </w:r>
           </w:p>
         </w:tc>
@@ -5948,7 +6588,7 @@
                 <w:sz w:val="18"/>
                 <w:szCs w:val="18"/>
               </w:rPr>
-              <w:t xml:space="preserve">Identificador único del token.</w:t>
+              <w:t>Identificador único del token.</w:t>
             </w:r>
           </w:p>
         </w:tc>
@@ -5969,7 +6609,7 @@
                 <w:sz w:val="18"/>
                 <w:szCs w:val="18"/>
               </w:rPr>
-              <w:t xml:space="preserve">valor</w:t>
+              <w:t>valor (UNIQUE)</w:t>
             </w:r>
           </w:p>
         </w:tc>
@@ -5985,7 +6625,7 @@
                 <w:sz w:val="18"/>
                 <w:szCs w:val="18"/>
               </w:rPr>
-              <w:t xml:space="preserve">String</w:t>
+              <w:t>String</w:t>
             </w:r>
           </w:p>
         </w:tc>
@@ -6001,7 +6641,7 @@
                 <w:sz w:val="18"/>
                 <w:szCs w:val="18"/>
               </w:rPr>
-              <w:t xml:space="preserve">Valor de la credencial de autenticación.</w:t>
+              <w:t>Valor de la credencial de autenticación.</w:t>
             </w:r>
           </w:p>
         </w:tc>
@@ -6022,7 +6662,7 @@
                 <w:sz w:val="18"/>
                 <w:szCs w:val="18"/>
               </w:rPr>
-              <w:t xml:space="preserve">fechaCreacion</w:t>
+              <w:t>fechaCreacion</w:t>
             </w:r>
           </w:p>
         </w:tc>
@@ -6038,7 +6678,7 @@
                 <w:sz w:val="18"/>
                 <w:szCs w:val="18"/>
               </w:rPr>
-              <w:t xml:space="preserve">DateTime</w:t>
+              <w:t>DateTime</w:t>
             </w:r>
           </w:p>
         </w:tc>
@@ -6054,7 +6694,7 @@
                 <w:sz w:val="18"/>
                 <w:szCs w:val="18"/>
               </w:rPr>
-              <w:t xml:space="preserve">Fecha y hora de generación.</w:t>
+              <w:t>Fecha y hora de generación.</w:t>
             </w:r>
           </w:p>
         </w:tc>
@@ -6075,7 +6715,7 @@
                 <w:sz w:val="18"/>
                 <w:szCs w:val="18"/>
               </w:rPr>
-              <w:t xml:space="preserve">fechaExpiracion</w:t>
+              <w:t>fechaExpiracion</w:t>
             </w:r>
           </w:p>
         </w:tc>
@@ -6091,7 +6731,7 @@
                 <w:sz w:val="18"/>
                 <w:szCs w:val="18"/>
               </w:rPr>
-              <w:t xml:space="preserve">DateTime</w:t>
+              <w:t>DateTime</w:t>
             </w:r>
           </w:p>
         </w:tc>
@@ -6107,7 +6747,7 @@
                 <w:sz w:val="18"/>
                 <w:szCs w:val="18"/>
               </w:rPr>
-              <w:t xml:space="preserve">Fecha de vencimiento del token.</w:t>
+              <w:t>Fecha de vencimiento del token.</w:t>
             </w:r>
           </w:p>
         </w:tc>
@@ -6128,7 +6768,7 @@
                 <w:sz w:val="18"/>
                 <w:szCs w:val="18"/>
               </w:rPr>
-              <w:t xml:space="preserve">estado</w:t>
+              <w:t>estado</w:t>
             </w:r>
           </w:p>
         </w:tc>
@@ -6144,7 +6784,7 @@
                 <w:sz w:val="18"/>
                 <w:szCs w:val="18"/>
               </w:rPr>
-              <w:t xml:space="preserve">boolean</w:t>
+              <w:t>boolean</w:t>
             </w:r>
           </w:p>
         </w:tc>
@@ -6160,7 +6800,60 @@
                 <w:sz w:val="18"/>
                 <w:szCs w:val="18"/>
               </w:rPr>
-              <w:t xml:space="preserve">Indica si está vigente o revocado.</w:t>
+              <w:t>Indica si está vigente o revocado.</w:t>
+            </w:r>
+          </w:p>
+        </w:tc>
+      </w:tr>
+      <w:tr>
+        <w:trPr>
+          <w:cantSplit/>
+        </w:trPr>
+        <w:tc>
+          <w:tcPr>
+            <w:tcW w:type="dxa" w:w="2143"/>
+          </w:tcPr>
+          <w:p>
+            <w:r>
+              <w:rPr>
+                <w:b w:val="false"/>
+                <w:bCs w:val="false"/>
+                <w:sz w:val="18"/>
+                <w:szCs w:val="18"/>
+              </w:rPr>
+              <w:t>sistema_externo_id (FK)</w:t>
+            </w:r>
+          </w:p>
+        </w:tc>
+        <w:tc>
+          <w:tcPr>
+            <w:tcW w:type="dxa" w:w="1143"/>
+          </w:tcPr>
+          <w:p>
+            <w:r>
+              <w:rPr>
+                <w:b w:val="false"/>
+                <w:bCs w:val="false"/>
+                <w:sz w:val="18"/>
+                <w:szCs w:val="18"/>
+              </w:rPr>
+              <w:t>int</w:t>
+            </w:r>
+          </w:p>
+        </w:tc>
+        <w:tc>
+          <w:tcPr>
+            <w:tcW w:type="dxa" w:w="5714"/>
+          </w:tcPr>
+          <w:p>
+            <w:r>
+              <w:rPr>
+                <w:b w:val="false"/>
+                <w:bCs w:val="false"/>
+                <w:sz w:val="18"/>
+                <w:szCs w:val="18"/>
+              </w:rPr>
+              <w:t>Sistema externo que posee el token; referencia a SistemaExterno.id.</w:t>
             </w:r>
           </w:p>
         </w:tc>

</xml_diff>